<commit_message>
Remove references section from all resume files and website
</commit_message>
<xml_diff>
--- a/Resume - Charles Michael Cayno (ATS v2).docx
+++ b/Resume - Charles Michael Cayno (ATS v2).docx
@@ -829,51 +829,6 @@
         <w:t>DOPL and FPGA Training</w:t>
       </w:r>
     </w:p>
-    <w:p>
-      <w:pPr>
-        <w:keepNext/>
-        <w:spacing w:before="200" w:after="60"/>
-      </w:pPr>
-      <w:r>
-        <w:rPr>
-          <w:rFonts w:ascii="Calibri" w:hAnsi="Calibri"/>
-          <w:b/>
-          <w:color w:val="003366"/>
-          <w:sz w:val="23"/>
-        </w:rPr>
-        <w:t>REFERENCES</w:t>
-      </w:r>
-    </w:p>
-    <w:p>
-      <w:pPr>
-        <w:pStyle w:val="ListBullet"/>
-        <w:spacing w:before="0" w:after="50"/>
-      </w:pPr>
-      <w:r>
-        <w:rPr>
-          <w:b/>
-        </w:rPr>
-        <w:t xml:space="preserve">Donnie Rey Saturno </w:t>
-      </w:r>
-      <w:r>
-        <w:t>— Senior Applications Engineering Manager (DonnieRey.Saturno@power.com)</w:t>
-      </w:r>
-    </w:p>
-    <w:p>
-      <w:pPr>
-        <w:pStyle w:val="ListBullet"/>
-        <w:spacing w:before="0" w:after="50"/>
-      </w:pPr>
-      <w:r>
-        <w:rPr>
-          <w:b/>
-        </w:rPr>
-        <w:t xml:space="preserve">Marvin Ralph Bautista </w:t>
-      </w:r>
-      <w:r>
-        <w:t>— Staff Engineer, New Product Definition (ralph.bautista@power.com)</w:t>
-      </w:r>
-    </w:p>
     <w:sectPr>
       <w:pgSz w:w="12240" w:h="15840"/>
       <w:pgMar w:top="1080" w:right="1080" w:bottom="1080" w:left="1080" w:header="720" w:footer="720" w:gutter="0"/>

</xml_diff>

<commit_message>
Add TST-326 / LHBA-155 (215W InnoMux2-1700V Server Auxiliary Power Supply) to resume files and website
</commit_message>
<xml_diff>
--- a/Resume - Charles Michael Cayno (ATS v2).docx
+++ b/Resume - Charles Michael Cayno (ATS v2).docx
@@ -217,7 +217,7 @@
         <w:spacing w:before="0" w:after="50"/>
       </w:pPr>
       <w:r>
-        <w:t>Lead the end-to-end design, topology selection, and hardware development of high-efficiency AC-DC and DC-DC power supply systems for smart home automation, high-voltage industrial, and smart lighting applications.</w:t>
+        <w:t>Lead the end-to-end design, topology selection, and hardware development of high-efficiency AC-DC and DC-DC power supply systems for smart home automation, high-voltage industrial, server auxiliary, and smart lighting applications.</w:t>
       </w:r>
     </w:p>
     <w:p>
@@ -254,6 +254,21 @@
       </w:pPr>
       <w:r>
         <w:t>Author technical papers, collaborate with cross-functional engineering teams, and mentor junior engineers in power electronics design and testing.</w:t>
+      </w:r>
+    </w:p>
+    <w:p>
+      <w:pPr>
+        <w:pStyle w:val="ListBullet"/>
+        <w:spacing w:before="0" w:after="50"/>
+      </w:pPr>
+      <w:r>
+        <w:rPr>
+          <w:b/>
+        </w:rPr>
+        <w:t xml:space="preserve">TST-326 / LHBA-155 (215W InnoMux2-1700V Server Auxiliary Power Supply): </w:t>
+      </w:r>
+      <w:r>
+        <w:t>Architected and evaluated a 215W peak (170W continuous) 48V/3.55A high-voltage power supply for server auxiliary applications operating from 700V–860V DC input using InnoMux2 1700V (IMX2353F). Designed custom PQ32/20 magnetics, executed secondary IC trim verification (IMX2353F-EW2E), developed specialized interposer test hardware with 3D-printed mounting fixtures, and built automated Python ATE test routines.</w:t>
       </w:r>
     </w:p>
     <w:p>

</xml_diff>

<commit_message>
Update TST-326 project entry to an industry-standard generalized description for external readability
</commit_message>
<xml_diff>
--- a/Resume - Charles Michael Cayno (ATS v2).docx
+++ b/Resume - Charles Michael Cayno (ATS v2).docx
@@ -265,10 +265,10 @@
         <w:rPr>
           <w:b/>
         </w:rPr>
-        <w:t xml:space="preserve">TST-326 / LHBA-155 (215W InnoMux2-1700V Server Auxiliary Power Supply): </w:t>
+        <w:t xml:space="preserve">High-Voltage Server Auxiliary Power Supply (215W / 1700V Integrated Switcher Architecture): </w:t>
       </w:r>
       <w:r>
-        <w:t>Architected and evaluated a 215W peak (170W continuous) 48V/3.55A high-voltage power supply for server auxiliary applications operating from 700V–860V DC input using InnoMux2 1700V (IMX2353F). Designed custom PQ32/20 magnetics, executed secondary IC trim verification (IMX2353F-EW2E), developed specialized interposer test hardware with 3D-printed mounting fixtures, and built automated Python ATE test routines.</w:t>
+        <w:t>Architected and evaluated a 215W peak (170W continuous) 48V/3.55A auxiliary power supply for data center and server power delivery architectures operating from a 700V–860V DC bus using a 1700V integrated power switcher IC. Designed custom PQ32/20 power magnetics, executed custom secondary IC trim configuration, developed specialized interposer test hardware with 3D-printed forced-air thermal mounting, and implemented automated Python ATE routines for efficiency and transient characterization.</w:t>
       </w:r>
     </w:p>
     <w:p>

</xml_diff>

<commit_message>
Update Server Aux project entry to reflect ongoing design and prototyping status
</commit_message>
<xml_diff>
--- a/Resume - Charles Michael Cayno (ATS v2).docx
+++ b/Resume - Charles Michael Cayno (ATS v2).docx
@@ -265,10 +265,10 @@
         <w:rPr>
           <w:b/>
         </w:rPr>
-        <w:t xml:space="preserve">High-Voltage Server Auxiliary Power Supply (215W / 1700V Integrated Switcher Architecture): </w:t>
+        <w:t xml:space="preserve">High-Voltage Server Auxiliary Power Supply (215W / 1700V Integrated Switcher Architecture) [Ongoing Design]: </w:t>
       </w:r>
       <w:r>
-        <w:t>Architected and evaluated a 215W peak (170W continuous) 48V/3.55A auxiliary power supply for data center and server power delivery architectures operating from a 700V–860V DC bus using a 1700V integrated power switcher IC. Designed custom PQ32/20 power magnetics, executed custom secondary IC trim configuration, developed specialized interposer test hardware with 3D-printed forced-air thermal mounting, and implemented automated Python ATE routines for efficiency and transient characterization.</w:t>
+        <w:t>Architecting and prototyping a 215W peak (170W continuous) 48V/3.55A auxiliary power supply for data center and server power delivery architectures operating from a 700V–860V DC bus using a 1700V integrated power switcher IC. Designed custom PQ32/20 power magnetics, executed custom secondary IC trim configuration, developing specialized interposer test hardware with 3D-printed forced-air thermal mounting, and building automated Python ATE test routines.</w:t>
       </w:r>
     </w:p>
     <w:p>

</xml_diff>

<commit_message>
Update phrasing to: across 20+ power IC products (spanning InnoSwitch, TinySwitch, LinkSwitch, and LYTSwitch families)
</commit_message>
<xml_diff>
--- a/Resume - Charles Michael Cayno (ATS v2).docx
+++ b/Resume - Charles Michael Cayno (ATS v2).docx
@@ -52,7 +52,7 @@
         <w:spacing w:before="0" w:after="80"/>
       </w:pPr>
       <w:r>
-        <w:t>Results-driven Senior Power Supply Design Engineer with over 6 years of professional experience in the design, development, simulation, and validation of high-efficiency AC-DC and DC-DC power supply systems. Recognized expert in switch-mode power supply (SMPS) topologies, custom magnetic component design, high dv/dt &amp; thermal stress analysis, and EMI/EMC mitigation. Proven capability in digital power control, automated multi-instrument testing across 20+ IC product families with Python, global project execution (including US engineering assignment), conference paper authoring (PCIM), and product qualification under global regulatory standards. Skilled in leading engineering projects, cross-functional collaboration, and mentoring technical teams.</w:t>
+        <w:t>Results-driven Senior Power Supply Design Engineer with over 6 years of professional experience in the design, development, simulation, and validation of high-efficiency AC-DC and DC-DC power supply systems. Recognized expert in switch-mode power supply (SMPS) topologies, custom magnetic component design, high dv/dt &amp; thermal stress analysis, and EMI/EMC mitigation. Proven capability in digital power control, automated multi-instrument testing across 20+ power IC products with Python, global project execution (including US engineering assignment), conference paper authoring (PCIM), and product qualification under global regulatory standards. Skilled in leading engineering projects, cross-functional collaboration, and mentoring technical teams.</w:t>
       </w:r>
     </w:p>
     <w:p>
@@ -142,7 +142,7 @@
         <w:t xml:space="preserve">Test Automation &amp; Software: </w:t>
       </w:r>
       <w:r>
-        <w:t>Python 3 Automation Libraries, GUI Development, Automated Multi-Instrument Testing Across 20+ IC Product Families, Test Automation (GPIB, VISA, Instrument Control), C/C++, MATLAB.</w:t>
+        <w:t>Python 3 Automation Libraries, GUI Development, Automated Multi-Instrument Testing Across 20+ Power IC Products, Test Automation (GPIB, VISA, Instrument Control), C/C++, MATLAB.</w:t>
       </w:r>
     </w:p>
     <w:p>
@@ -535,7 +535,7 @@
         <w:spacing w:before="0" w:after="50"/>
       </w:pPr>
       <w:r>
-        <w:t>Executed fabrication-assembly transfer evaluations, hardware validation, and automated multi-instrument testing across 20+ IC product families (InnoSwitch3, TinySwitch, and LYTSwitch families).</w:t>
+        <w:t>Executed fabrication-assembly transfer evaluations, hardware validation, and automated multi-instrument testing across 20+ power IC products (spanning InnoSwitch, TinySwitch, LinkSwitch, and LYTSwitch families).</w:t>
       </w:r>
     </w:p>
     <w:p>

</xml_diff>